<commit_message>
Update document templates and enhance data handling
- Modified the certificate document template to remove unnecessary formatting for issued certificates.
- Updated the protocol document template to include commission member positions for better clarity.
- Enhanced the AttestationGroupsPage to include welder counts by group, improving data representation.
- Refactored the handling of group status filters in the AttestationWeldersPage for consistency.
- Introduced new components for document download and deletion, streamlining template management.
- Improved user experience with better feedback and validation in form submissions.
</commit_message>
<xml_diff>
--- a/forms/certificate.docx
+++ b/forms/certificate.docx
@@ -184,7 +184,7 @@
                 <w:bCs/>
                 <w:sz w:val="24"/>
                 <w:szCs w:val="24"/>
-                <w:lang w:val="en-US"/>
+                <w:lang w:val="uk-UA"/>
               </w:rPr>
               <w:t>{</w:t>
             </w:r>
@@ -206,9 +206,29 @@
                 <w:bCs/>
                 <w:sz w:val="24"/>
                 <w:szCs w:val="24"/>
+                <w:lang w:val="uk-UA"/>
+              </w:rPr>
+              <w:t>-</w:t>
+            </w:r>
+            <w:r>
+              <w:rPr>
+                <w:b/>
+                <w:bCs/>
+                <w:sz w:val="24"/>
+                <w:szCs w:val="24"/>
                 <w:lang w:val="en-US"/>
               </w:rPr>
-              <w:t>-number}</w:t>
+              <w:t>number</w:t>
+            </w:r>
+            <w:r>
+              <w:rPr>
+                <w:b/>
+                <w:bCs/>
+                <w:sz w:val="24"/>
+                <w:szCs w:val="24"/>
+                <w:lang w:val="uk-UA"/>
+              </w:rPr>
+              <w:t>}</w:t>
             </w:r>
           </w:p>
           <w:p>
@@ -480,25 +500,7 @@
                 <w:color w:val="002060"/>
                 <w:lang w:val="en-US"/>
               </w:rPr>
-              <w:t>{first</w:t>
-            </w:r>
-            <w:r>
-              <w:rPr>
-                <w:b/>
-                <w:bCs/>
-                <w:color w:val="002060"/>
-                <w:lang w:val="en-US"/>
-              </w:rPr>
-              <w:t>-name</w:t>
-            </w:r>
-            <w:r>
-              <w:rPr>
-                <w:b/>
-                <w:bCs/>
-                <w:color w:val="002060"/>
-                <w:lang w:val="en-US"/>
-              </w:rPr>
-              <w:t>}</w:t>
+              <w:t>{first-name}</w:t>
             </w:r>
           </w:p>
           <w:p>
@@ -2905,18 +2907,24 @@
               <w:keepLines/>
               <w:ind w:left="364" w:right="312"/>
               <w:rPr>
+                <w:b/>
+                <w:bCs/>
                 <w:color w:val="002060"/>
-                <w:lang w:val="uk-UA"/>
+                <w:lang w:val="en-US"/>
               </w:rPr>
             </w:pPr>
             <w:r>
               <w:rPr>
+                <w:b/>
+                <w:bCs/>
                 <w:lang w:val="uk-UA"/>
               </w:rPr>
               <w:t xml:space="preserve">    </w:t>
             </w:r>
             <w:r>
               <w:rPr>
+                <w:b/>
+                <w:bCs/>
                 <w:lang w:val="en-US"/>
               </w:rPr>
               <w:t>{</w:t>
@@ -2960,15 +2968,6 @@
                 <w:lang w:val="en-US"/>
               </w:rPr>
               <w:t>}</w:t>
-            </w:r>
-            <w:r>
-              <w:rPr>
-                <w:b/>
-                <w:bCs/>
-                <w:color w:val="002060"/>
-                <w:lang w:val="uk-UA"/>
-              </w:rPr>
-              <w:t>.</w:t>
             </w:r>
           </w:p>
           <w:p>

</xml_diff>